<commit_message>
Versão 2.0 da minuta: usufrutuários fora da regra e dívida zero
- Meta III passa a R$ 1.600.000,00.
- Usufrutuários integralmente excluídos: os frutos das participações
  gravadas lhes pertencem por direito e seguem pagos sem limite ou
  condição. A trava alcança filhos, cotistas e sócios admitidos no
  futuro, inclusive colaboradores em partnership.
- Meta I passa a exigir dívida zero, com perímetro explicitando
  financiamentos, empréstimos, fornecedores e prestadores, tributos,
  multas, custas e emolumentos cartorários. Removido o conceito de
  dívida equacionada: parcelamento em curso não é dívida quitada.
- Nova comprovação objetiva da Meta I por certidões, ausência de
  protesto, ausência de restrição em Serasa/SPC e baixa de gravames.
- Dívidas estritamente particulares de cada sócio ficam fora do
  perímetro.

Co-Authored-By: Claude Opus 5 <noreply@anthropic.com>
Claude-Session: https://claude.ai/code/session_017S3Nxpn86HbRVN26NB9rcj
</commit_message>
<xml_diff>
--- a/docs/Minuta-Distribuicao-por-Metas.docx
+++ b/docs/Minuta-Distribuicao-por-Metas.docx
@@ -17,7 +17,7 @@
           <w:sz w:val="15"/>
           <w:szCs w:val="15"/>
         </w:rPr>
-        <w:t xml:space="preserve">MINUTA PARA DISCUSSÃO INTERNA  ·  VERSÃO 1.0  ·  NÃO ASSINADA</w:t>
+        <w:t xml:space="preserve">MINUTA PARA DISCUSSÃO INTERNA  ·  VERSÃO 2.0  ·  NÃO ASSINADA</w:t>
       </w:r>
     </w:p>
     <w:p>
@@ -48,7 +48,7 @@
           <w:sz w:val="18"/>
           <w:szCs w:val="18"/>
         </w:rPr>
-        <w:t xml:space="preserve">Proposta de redação para uma cláusula do acordo de sócios da holding familiar: nenhum filho retira lucro enquanto as dívidas do grupo não estiverem quitadas, o caixa formado e a moradia da mãe garantida — sem prazo mínimo e sem prazo máximo. Escopo limitado à destinação de resultados.</w:t>
+        <w:t xml:space="preserve">Proposta de redação para uma cláusula do acordo de sócios da holding familiar: nenhum sócio retira lucro enquanto o grupo não estiver com dívida zero, caixa formado e a moradia da mãe garantida — sem prazo mínimo e sem prazo máximo. Os pais, usufrutuários, estão fora desta regra.</w:t>
       </w:r>
     </w:p>
     <w:p>
@@ -178,7 +178,7 @@
           <w:sz w:val="19"/>
           <w:szCs w:val="19"/>
         </w:rPr>
-        <w:t xml:space="preserve">Dívida quitada, saldo em caixa e reserva são fatos verificáveis em balanço, com certidão e ata — sem discussão futura sobre quem pode retirar o quê.</w:t>
+        <w:t xml:space="preserve">Dívida zero, saldo em caixa e reserva são fatos verificáveis em balanço, certidão e ata — sem discussão futura sobre quem pode retirar o quê.</w:t>
       </w:r>
     </w:p>
     <w:p>
@@ -269,7 +269,7 @@
                 <w:sz w:val="19"/>
                 <w:szCs w:val="19"/>
               </w:rPr>
-              <w:t xml:space="preserve">Extinção do perímetro</w:t>
+              <w:t xml:space="preserve">Dívida zero</w:t>
             </w:r>
           </w:p>
           <w:p>
@@ -286,7 +286,7 @@
                 <w:sz w:val="19"/>
                 <w:szCs w:val="19"/>
               </w:rPr>
-              <w:t xml:space="preserve">100% das dívidas</w:t>
+              <w:t xml:space="preserve">100% do perímetro</w:t>
             </w:r>
           </w:p>
         </w:tc>
@@ -309,10 +309,10 @@
               <w:rPr>
                 <w:rFonts w:ascii="Cambria" w:cs="Cambria" w:eastAsia="Cambria" w:hAnsi="Cambria"/>
                 <w:color w:val="4A5850"/>
-                <w:sz w:val="19"/>
-                <w:szCs w:val="19"/>
+                <w:sz w:val="18"/>
+                <w:szCs w:val="18"/>
               </w:rPr>
-              <w:t xml:space="preserve">Originadas nos negócios conduzidos pelo patriarca — em nome da Grison e Cia, das pessoas físicas ou das satélites, seja qual for o nome no contrato.</w:t>
+              <w:t xml:space="preserve">Saldo zero de tudo — financiamentos, empréstimos, fornecedores, tributos, multas, custas e emolumentos. Só não conta o adiantamento do loteador.</w:t>
             </w:r>
           </w:p>
         </w:tc>
@@ -410,10 +410,10 @@
               <w:rPr>
                 <w:rFonts w:ascii="Cambria" w:cs="Cambria" w:eastAsia="Cambria" w:hAnsi="Cambria"/>
                 <w:color w:val="4A5850"/>
-                <w:sz w:val="19"/>
-                <w:szCs w:val="19"/>
+                <w:sz w:val="18"/>
+                <w:szCs w:val="18"/>
               </w:rPr>
-              <w:t xml:space="preserve">Caixa livre consolidado, sustentado por dois balancetes consecutivos. Impede que a próxima parcela ou multa vire nova dívida.</w:t>
+              <w:t xml:space="preserve">Caixa livre consolidado, sustentado por dois balancetes consecutivos. Impede que a próxima parcela vire nova dívida.</w:t>
             </w:r>
           </w:p>
         </w:tc>
@@ -488,7 +488,7 @@
                 <w:sz w:val="19"/>
                 <w:szCs w:val="19"/>
               </w:rPr>
-              <w:t xml:space="preserve">R$ 1.060.000,00 *</w:t>
+              <w:t xml:space="preserve">R$ 1.600.000,00</w:t>
             </w:r>
           </w:p>
         </w:tc>
@@ -511,8 +511,8 @@
               <w:rPr>
                 <w:rFonts w:ascii="Cambria" w:cs="Cambria" w:eastAsia="Cambria" w:hAnsi="Cambria"/>
                 <w:color w:val="4A5850"/>
-                <w:sz w:val="19"/>
-                <w:szCs w:val="19"/>
+                <w:sz w:val="18"/>
+                <w:szCs w:val="18"/>
               </w:rPr>
               <w:t xml:space="preserve">Reserva vinculada para o imóvel residencial da Sra. Elman, ou imóvel já adquirido. Vem antes de qualquer retirada dos filhos.</w:t>
             </w:r>
@@ -522,28 +522,39 @@
     </w:tbl>
     <w:p>
       <w:pPr>
-        <w:spacing w:after="0" w:before="120"/>
-        <w:jc w:val="both"/>
-      </w:pPr>
-      <w:r>
-        <w:rPr>
-          <w:rFonts w:ascii="Cambria" w:cs="Cambria" w:eastAsia="Cambria" w:hAnsi="Cambria"/>
-          <w:b/>
-          <w:bCs/>
-          <w:color w:val="141C17"/>
-          <w:sz w:val="19"/>
-          <w:szCs w:val="19"/>
-        </w:rPr>
-        <w:t xml:space="preserve">Fora da conta: </w:t>
+        <w:spacing w:after="0" w:before="110"/>
+        <w:jc w:val="both"/>
+      </w:pPr>
+      <w:r>
+        <w:rPr>
+          <w:rFonts w:ascii="Cambria" w:cs="Cambria" w:eastAsia="Cambria" w:hAnsi="Cambria"/>
+          <w:b/>
+          <w:bCs/>
+          <w:color w:val="141C17"/>
+          <w:sz w:val="18"/>
+          <w:szCs w:val="18"/>
+        </w:rPr>
+        <w:t xml:space="preserve">Quem está sujeito à regra: </w:t>
       </w:r>
       <w:r>
         <w:rPr>
           <w:rFonts w:ascii="Cambria" w:cs="Cambria" w:eastAsia="Cambria" w:hAnsi="Cambria"/>
           <w:color w:val="4A5850"/>
-          <w:sz w:val="19"/>
-          <w:szCs w:val="19"/>
-        </w:rPr>
-        <w:t xml:space="preserve">o adiantamento do loteador parceiro (Santa Helena) não entra na Meta I. Ele é autoliquidável — o próprio loteador retém os valores devidos ao grupo até recompor o adiantamento e só depois repassa o excedente. Não há o que quitar, há o que aguardar.</w:t>
+          <w:sz w:val="18"/>
+          <w:szCs w:val="18"/>
+        </w:rPr>
+        <w:t xml:space="preserve">filhos, cotistas e sócios admitidos no futuro, inclusive colaboradores em partnership. </w:t>
+      </w:r>
+      <w:r>
+        <w:rPr>
+          <w:rFonts w:ascii="Cambria" w:cs="Cambria" w:eastAsia="Cambria" w:hAnsi="Cambria"/>
+          <w:b/>
+          <w:bCs/>
+          <w:color w:val="4A5850"/>
+          <w:sz w:val="18"/>
+          <w:szCs w:val="18"/>
+        </w:rPr>
+        <w:t xml:space="preserve">Os usufrutuários Wilson e Elman estão fora: os frutos lhes pertencem por direito e seguem pagos integralmente, sem limite e sem condição.</w:t>
       </w:r>
     </w:p>
     <w:p>
@@ -578,21 +589,61 @@
           <w:sz w:val="19"/>
           <w:szCs w:val="19"/>
         </w:rPr>
-        <w:t xml:space="preserve">1. Princípio. </w:t>
-      </w:r>
-      <w:r>
-        <w:rPr>
-          <w:rFonts w:ascii="Cambria" w:cs="Cambria" w:eastAsia="Cambria" w:hAnsi="Cambria"/>
-          <w:color w:val="141C17"/>
-          <w:sz w:val="19"/>
-          <w:szCs w:val="19"/>
-        </w:rPr>
-        <w:t xml:space="preserve">A distribuição de lucros, dividendos, juros sobre capital próprio ou qualquer outra forma de retorno do capital aos nu-proprietários não é regida por prazo, mas pelo cumprimento cumulativo das três Metas do item 3, tenha esse cumprimento a duração que tiver. Até lá, os resultados são integralmente retidos e destinados a esse cumprimento.</w:t>
-      </w:r>
-    </w:p>
-    <w:p>
-      <w:pPr>
-        <w:spacing w:after="60" w:before="60"/>
+        <w:t xml:space="preserve">1. Princípio e alcance. </w:t>
+      </w:r>
+      <w:r>
+        <w:rPr>
+          <w:rFonts w:ascii="Cambria" w:cs="Cambria" w:eastAsia="Cambria" w:hAnsi="Cambria"/>
+          <w:color w:val="141C17"/>
+          <w:sz w:val="19"/>
+          <w:szCs w:val="19"/>
+        </w:rPr>
+        <w:t xml:space="preserve">A distribuição de lucros, dividendos, juros sobre capital próprio ou qualquer outra forma de retorno do capital aos </w:t>
+      </w:r>
+      <w:r>
+        <w:rPr>
+          <w:rFonts w:ascii="Cambria" w:cs="Cambria" w:eastAsia="Cambria" w:hAnsi="Cambria"/>
+          <w:b/>
+          <w:bCs/>
+          <w:color w:val="141C17"/>
+          <w:sz w:val="19"/>
+          <w:szCs w:val="19"/>
+        </w:rPr>
+        <w:t xml:space="preserve">Sócios Sujeitos à Retenção</w:t>
+      </w:r>
+      <w:r>
+        <w:rPr>
+          <w:rFonts w:ascii="Cambria" w:cs="Cambria" w:eastAsia="Cambria" w:hAnsi="Cambria"/>
+          <w:color w:val="141C17"/>
+          <w:sz w:val="19"/>
+          <w:szCs w:val="19"/>
+        </w:rPr>
+        <w:t xml:space="preserve"> não é regida por prazo, mas pelo cumprimento cumulativo das três Metas do item 3. São Sócios Sujeitos à Retenção os filhos nu-proprietários, os demais cotistas e quaisquer sócios admitidos no futuro, inclusive colaboradores em regime de partnership. </w:t>
+      </w:r>
+      <w:r>
+        <w:rPr>
+          <w:rFonts w:ascii="Cambria" w:cs="Cambria" w:eastAsia="Cambria" w:hAnsi="Cambria"/>
+          <w:b/>
+          <w:bCs/>
+          <w:color w:val="141C17"/>
+          <w:sz w:val="19"/>
+          <w:szCs w:val="19"/>
+        </w:rPr>
+        <w:t xml:space="preserve">Esta Cláusula não se aplica aos usufrutuários</w:t>
+      </w:r>
+      <w:r>
+        <w:rPr>
+          <w:rFonts w:ascii="Cambria" w:cs="Cambria" w:eastAsia="Cambria" w:hAnsi="Cambria"/>
+          <w:color w:val="141C17"/>
+          <w:sz w:val="19"/>
+          <w:szCs w:val="19"/>
+        </w:rPr>
+        <w:t xml:space="preserve"> Wilson Grison e Elman M. Coelho Grison: os frutos das participações gravadas com usufruto lhes pertencem por direito próprio e são pagos integralmente, sem limite, prazo ou condição.</w:t>
+      </w:r>
+    </w:p>
+    <w:p>
+      <w:pPr>
+        <w:spacing w:after="50" w:before="50"/>
         <w:jc w:val="both"/>
       </w:pPr>
       <w:r>
@@ -622,36 +673,36 @@
           <w:sz w:val="19"/>
           <w:szCs w:val="19"/>
         </w:rPr>
-        <w:t xml:space="preserve">2.1  Perímetro de Endividamento Familiar. </w:t>
-      </w:r>
-      <w:r>
-        <w:rPr>
-          <w:rFonts w:ascii="Cambria" w:cs="Cambria" w:eastAsia="Cambria" w:hAnsi="Cambria"/>
-          <w:color w:val="141C17"/>
-          <w:sz w:val="19"/>
-          <w:szCs w:val="19"/>
-        </w:rPr>
-        <w:t xml:space="preserve">Todas as obrigações pecuniárias, de qualquer natureza e ainda que vincendas, originadas nos negócios conduzidos, liderados ou orientados pelo Sr. Wilson Grison, </w:t>
-      </w:r>
-      <w:r>
-        <w:rPr>
-          <w:rFonts w:ascii="Cambria" w:cs="Cambria" w:eastAsia="Cambria" w:hAnsi="Cambria"/>
-          <w:b/>
-          <w:bCs/>
-          <w:color w:val="141C17"/>
-          <w:sz w:val="19"/>
-          <w:szCs w:val="19"/>
-        </w:rPr>
-        <w:t xml:space="preserve">independentemente da pessoa física ou jurídica em cujo nome tenham sido contraídas</w:t>
-      </w:r>
-      <w:r>
-        <w:rPr>
-          <w:rFonts w:ascii="Cambria" w:cs="Cambria" w:eastAsia="Cambria" w:hAnsi="Cambria"/>
-          <w:color w:val="141C17"/>
-          <w:sz w:val="19"/>
-          <w:szCs w:val="19"/>
-        </w:rPr>
-        <w:t xml:space="preserve">: as da Grison e Cia Ltda.; as pessoais de Wilson e de Elman M. Coelho Grison como devedores, avalistas, fiadores ou coobrigados; e as das sociedades por eles constituídas, controladas ou dirigidas de fato, ainda que registradas em nome de filhos, cônjuge ou terceiros — EMC Grison, Bioaçaí, ML Serviços Agrícolas, Natyrê, Tiúba 2 SPE e Patrimônio Digital. A relação consta do Anexo I, aprovado em até 90 dias e atualizado semestralmente; obrigação não listada que se enquadre nesta definição integra o Perímetro.</w:t>
+        <w:t xml:space="preserve">2.1  Perímetro de Endividamento do Grupo. </w:t>
+      </w:r>
+      <w:r>
+        <w:rPr>
+          <w:rFonts w:ascii="Cambria" w:cs="Cambria" w:eastAsia="Cambria" w:hAnsi="Cambria"/>
+          <w:color w:val="141C17"/>
+          <w:sz w:val="19"/>
+          <w:szCs w:val="19"/>
+        </w:rPr>
+        <w:t xml:space="preserve">Todas as obrigações pecuniárias originadas nos negócios conduzidos, liderados ou orientados pelo Sr. Wilson Grison, </w:t>
+      </w:r>
+      <w:r>
+        <w:rPr>
+          <w:rFonts w:ascii="Cambria" w:cs="Cambria" w:eastAsia="Cambria" w:hAnsi="Cambria"/>
+          <w:b/>
+          <w:bCs/>
+          <w:color w:val="141C17"/>
+          <w:sz w:val="19"/>
+          <w:szCs w:val="19"/>
+        </w:rPr>
+        <w:t xml:space="preserve">independentemente da pessoa em cujo nome tenham sido contraídas</w:t>
+      </w:r>
+      <w:r>
+        <w:rPr>
+          <w:rFonts w:ascii="Cambria" w:cs="Cambria" w:eastAsia="Cambria" w:hAnsi="Cambria"/>
+          <w:color w:val="141C17"/>
+          <w:sz w:val="19"/>
+          <w:szCs w:val="19"/>
+        </w:rPr>
+        <w:t xml:space="preserve">, abrangendo financiamentos e empréstimos bancários, dívidas com fornecedores e prestadores de serviço, tributos de qualquer esfera, multas e autos de infração, custas e emolumentos cartorários, parcelamentos e transações, e obrigações decorrentes de garantias prestadas. Alcança as dívidas da Grison e Cia Ltda., as pessoais de Wilson e de Elman M. Coelho Grison como devedores, avalistas, fiadores ou coobrigados, e as das sociedades por eles constituídas, controladas ou dirigidas de fato, ainda que em nome de filhos, cônjuge ou terceiros — EMC Grison, Bioaçaí, ML Serviços Agrícolas, Natyrê, Tiúba 2 SPE e Patrimônio Digital. Obrigação não listada no Anexo I que se enquadre nesta definição integra o Perímetro.</w:t>
       </w:r>
     </w:p>
     <w:p>
@@ -669,16 +720,16 @@
           <w:sz w:val="19"/>
           <w:szCs w:val="19"/>
         </w:rPr>
-        <w:t xml:space="preserve">2.2  Dívida Quitada. </w:t>
-      </w:r>
-      <w:r>
-        <w:rPr>
-          <w:rFonts w:ascii="Cambria" w:cs="Cambria" w:eastAsia="Cambria" w:hAnsi="Cambria"/>
-          <w:color w:val="141C17"/>
-          <w:sz w:val="19"/>
-          <w:szCs w:val="19"/>
-        </w:rPr>
-        <w:t xml:space="preserve">Aquela cuja exigibilidade se extinguiu em face de todos os coobrigados — por pagamento, deságio, transação, novação, decisão transitada em julgado, prescrição ou assunção liberatória com exoneração dos garantidores. É indiferente o valor desembolsado: exige-se que a obrigação deixe de ser exigível do Perímetro.</w:t>
+        <w:t xml:space="preserve">2.2  Não integram o Perímetro </w:t>
+      </w:r>
+      <w:r>
+        <w:rPr>
+          <w:rFonts w:ascii="Cambria" w:cs="Cambria" w:eastAsia="Cambria" w:hAnsi="Cambria"/>
+          <w:color w:val="141C17"/>
+          <w:sz w:val="19"/>
+          <w:szCs w:val="19"/>
+        </w:rPr>
+        <w:t xml:space="preserve">as dívidas estritamente particulares de qualquer sócio, sem relação com os negócios do grupo, pelas quais cada um responde por conta própria.</w:t>
       </w:r>
     </w:p>
     <w:p>
@@ -696,16 +747,36 @@
           <w:sz w:val="19"/>
           <w:szCs w:val="19"/>
         </w:rPr>
-        <w:t xml:space="preserve">2.3  Dívida Equacionada. </w:t>
-      </w:r>
-      <w:r>
-        <w:rPr>
-          <w:rFonts w:ascii="Cambria" w:cs="Cambria" w:eastAsia="Cambria" w:hAnsi="Cambria"/>
-          <w:color w:val="141C17"/>
-          <w:sz w:val="19"/>
-          <w:szCs w:val="19"/>
-        </w:rPr>
-        <w:t xml:space="preserve">A obrigação em parcelamento ou transação regularmente deferida que, cumulativamente, esteja adimplente, não conte com garantia pessoal de qualquer dos nu-proprietários e tenha o saldo devedor integralmente provisionado em reserva vinculada não computável na Meta II. Vale como cumprida enquanto mantidos os requisitos.</w:t>
+        <w:t xml:space="preserve">2.3  Adiantamento Santa Helena. </w:t>
+      </w:r>
+      <w:r>
+        <w:rPr>
+          <w:rFonts w:ascii="Cambria" w:cs="Cambria" w:eastAsia="Cambria" w:hAnsi="Cambria"/>
+          <w:color w:val="141C17"/>
+          <w:sz w:val="19"/>
+          <w:szCs w:val="19"/>
+        </w:rPr>
+        <w:t xml:space="preserve">Valores antecipados pelo loteador parceiro por conta de resultados futuros da parceria, recompostos por retenção, pelo próprio loteador, dos repasses ao grupo. </w:t>
+      </w:r>
+      <w:r>
+        <w:rPr>
+          <w:rFonts w:ascii="Cambria" w:cs="Cambria" w:eastAsia="Cambria" w:hAnsi="Cambria"/>
+          <w:b/>
+          <w:bCs/>
+          <w:color w:val="141C17"/>
+          <w:sz w:val="19"/>
+          <w:szCs w:val="19"/>
+        </w:rPr>
+        <w:t xml:space="preserve">Está expressamente excluído do Perímetro</w:t>
+      </w:r>
+      <w:r>
+        <w:rPr>
+          <w:rFonts w:ascii="Cambria" w:cs="Cambria" w:eastAsia="Cambria" w:hAnsi="Cambria"/>
+          <w:color w:val="141C17"/>
+          <w:sz w:val="19"/>
+          <w:szCs w:val="19"/>
+        </w:rPr>
+        <w:t xml:space="preserve"> e não conta para a Meta I, por constituir obrigação de liquidação automática por compensação contratual, independente de desembolso ou de ato de gestão dos sócios. Consta do Anexo I apenas para informação.</w:t>
       </w:r>
     </w:p>
     <w:p>
@@ -723,36 +794,36 @@
           <w:sz w:val="19"/>
           <w:szCs w:val="19"/>
         </w:rPr>
-        <w:t xml:space="preserve">2.4  Adiantamento Santa Helena. </w:t>
-      </w:r>
-      <w:r>
-        <w:rPr>
-          <w:rFonts w:ascii="Cambria" w:cs="Cambria" w:eastAsia="Cambria" w:hAnsi="Cambria"/>
-          <w:color w:val="141C17"/>
-          <w:sz w:val="19"/>
-          <w:szCs w:val="19"/>
-        </w:rPr>
-        <w:t xml:space="preserve">Valores antecipados pelo loteador parceiro por conta de resultados futuros da parceria, recompostos por retenção, pelo próprio loteador, dos repasses devidos ao grupo. </w:t>
-      </w:r>
-      <w:r>
-        <w:rPr>
-          <w:rFonts w:ascii="Cambria" w:cs="Cambria" w:eastAsia="Cambria" w:hAnsi="Cambria"/>
-          <w:b/>
-          <w:bCs/>
-          <w:color w:val="141C17"/>
-          <w:sz w:val="19"/>
-          <w:szCs w:val="19"/>
-        </w:rPr>
-        <w:t xml:space="preserve">Está expressamente excluído do Perímetro</w:t>
-      </w:r>
-      <w:r>
-        <w:rPr>
-          <w:rFonts w:ascii="Cambria" w:cs="Cambria" w:eastAsia="Cambria" w:hAnsi="Cambria"/>
-          <w:color w:val="141C17"/>
-          <w:sz w:val="19"/>
-          <w:szCs w:val="19"/>
-        </w:rPr>
-        <w:t xml:space="preserve"> e não conta para a Meta I, por constituir obrigação de liquidação automática por compensação contratual, independente de desembolso ou de ato de gestão dos sócios. Consta do Anexo I apenas para informação.</w:t>
+        <w:t xml:space="preserve">2.4  Dívida Quitada. </w:t>
+      </w:r>
+      <w:r>
+        <w:rPr>
+          <w:rFonts w:ascii="Cambria" w:cs="Cambria" w:eastAsia="Cambria" w:hAnsi="Cambria"/>
+          <w:color w:val="141C17"/>
+          <w:sz w:val="19"/>
+          <w:szCs w:val="19"/>
+        </w:rPr>
+        <w:t xml:space="preserve">Aquela cujo saldo é zero e cuja exigibilidade se extinguiu em face de todos os coobrigados — por pagamento, deságio, transação, novação, decisão transitada em julgado, prescrição ou assunção liberatória com exoneração dos garantidores. É indiferente o valor desembolsado, mas </w:t>
+      </w:r>
+      <w:r>
+        <w:rPr>
+          <w:rFonts w:ascii="Cambria" w:cs="Cambria" w:eastAsia="Cambria" w:hAnsi="Cambria"/>
+          <w:b/>
+          <w:bCs/>
+          <w:color w:val="141C17"/>
+          <w:sz w:val="19"/>
+          <w:szCs w:val="19"/>
+        </w:rPr>
+        <w:t xml:space="preserve">parcelamento em curso, ainda que rigorosamente adimplente, não é dívida quitada</w:t>
+      </w:r>
+      <w:r>
+        <w:rPr>
+          <w:rFonts w:ascii="Cambria" w:cs="Cambria" w:eastAsia="Cambria" w:hAnsi="Cambria"/>
+          <w:color w:val="141C17"/>
+          <w:sz w:val="19"/>
+          <w:szCs w:val="19"/>
+        </w:rPr>
+        <w:t xml:space="preserve">.</w:t>
       </w:r>
     </w:p>
     <w:p>
@@ -779,12 +850,12 @@
           <w:sz w:val="19"/>
           <w:szCs w:val="19"/>
         </w:rPr>
-        <w:t xml:space="preserve">Caixa e equivalentes de livre movimentação da Companhia e controladas, excluídos os recursos vinculados à Meta III, os provisionados no item 2.3, os de terceiros e os valores bloqueados ou de destinação vinculada.</w:t>
-      </w:r>
-    </w:p>
-    <w:p>
-      <w:pPr>
-        <w:spacing w:after="80" w:before="60"/>
+        <w:t xml:space="preserve">Caixa e equivalentes de livre movimentação da Companhia e controladas, excluídos os recursos vinculados à Meta III, os de terceiros e os valores bloqueados ou de destinação vinculada.</w:t>
+      </w:r>
+    </w:p>
+    <w:p>
+      <w:pPr>
+        <w:spacing w:after="60" w:before="50"/>
         <w:jc w:val="both"/>
       </w:pPr>
       <w:r>
@@ -805,7 +876,54 @@
           <w:sz w:val="19"/>
           <w:szCs w:val="19"/>
         </w:rPr>
-        <w:t xml:space="preserve">(I) 100% das obrigações do Perímetro Quitadas ou Equacionadas, ressalvado o Adiantamento Santa Helena; (II) Caixa Mínimo igual ou superior a R$ 2.000.000,00, mantido por dois balancetes mensais consecutivos; (III) Reserva Moradia igual ou superior a R$ 1.060.000,00 destinada ao imóvel residencial da Sra. Elman, ou imóvel já adquirido e quitado. Os valores das Metas II e III são corrigidos anualmente pelo IPCA. O cumprimento parcial, ainda que de duas Metas, não autoriza distribuição parcial, proporcional ou antecipada.</w:t>
+        <w:t xml:space="preserve">(I) </w:t>
+      </w:r>
+      <w:r>
+        <w:rPr>
+          <w:rFonts w:ascii="Cambria" w:cs="Cambria" w:eastAsia="Cambria" w:hAnsi="Cambria"/>
+          <w:b/>
+          <w:bCs/>
+          <w:color w:val="141C17"/>
+          <w:sz w:val="19"/>
+          <w:szCs w:val="19"/>
+        </w:rPr>
+        <w:t xml:space="preserve">Dívida zero</w:t>
+      </w:r>
+      <w:r>
+        <w:rPr>
+          <w:rFonts w:ascii="Cambria" w:cs="Cambria" w:eastAsia="Cambria" w:hAnsi="Cambria"/>
+          <w:color w:val="141C17"/>
+          <w:sz w:val="19"/>
+          <w:szCs w:val="19"/>
+        </w:rPr>
+        <w:t xml:space="preserve">: saldo zero de 100% das obrigações do Perímetro, ressalvado o Adiantamento Santa Helena; (II) Caixa Mínimo igual ou superior a R$ 2.000.000,00, mantido por dois balancetes mensais consecutivos; (III) Reserva Moradia igual ou superior a R$ 1.600.000,00 destinada ao imóvel residencial da Sra. Elman, ou imóvel já adquirido e quitado. Os valores das Metas II e III são corrigidos anualmente pelo IPCA. O cumprimento parcial, ainda que de duas Metas, não autoriza distribuição parcial, proporcional ou antecipada.</w:t>
+      </w:r>
+    </w:p>
+    <w:p>
+      <w:pPr>
+        <w:spacing w:after="60" w:before="0"/>
+        <w:ind w:left="200"/>
+        <w:jc w:val="both"/>
+      </w:pPr>
+      <w:r>
+        <w:rPr>
+          <w:rFonts w:ascii="Cambria" w:cs="Cambria" w:eastAsia="Cambria" w:hAnsi="Cambria"/>
+          <w:b/>
+          <w:bCs/>
+          <w:color w:val="141C17"/>
+          <w:sz w:val="19"/>
+          <w:szCs w:val="19"/>
+        </w:rPr>
+        <w:t xml:space="preserve">3.1  Comprovação objetiva da Meta I. </w:t>
+      </w:r>
+      <w:r>
+        <w:rPr>
+          <w:rFonts w:ascii="Cambria" w:cs="Cambria" w:eastAsia="Cambria" w:hAnsi="Cambria"/>
+          <w:color w:val="141C17"/>
+          <w:sz w:val="19"/>
+          <w:szCs w:val="19"/>
+        </w:rPr>
+        <w:t xml:space="preserve">A Meta I só se tem por cumprida mediante, cumulativamente: certidões negativas — ou positivas com efeito de negativas — federais, estaduais e municipais da Grison e Cia Ltda. e das demais pessoas do Perímetro; ausência de protesto; ausência de anotação restritiva em Serasa, SPC ou equivalente relativa a obrigação do Perímetro; e baixa dos gravames que as garantiam. Anotação decorrente de dívida particular de sócio não impede o cumprimento da Meta.</w:t>
       </w:r>
     </w:p>
     <w:p>
@@ -831,7 +949,7 @@
           <w:sz w:val="19"/>
           <w:szCs w:val="19"/>
         </w:rPr>
-        <w:t xml:space="preserve">Até a Data de Liberação é vedada aos nu-proprietários qualquer distribuição de lucros, dividendos, juros sobre capital próprio, redução de capital com restituição, resgate ou reembolso, ressalvado o item 5. Os lucros retidos vão para reserva fundamentada em orçamento de capital aprovado anualmente em Assembleia (art. 196 da Lei 6.404/76), e o Estatuto fixará o dividendo obrigatório em percentual compatível com esta Cláusula (art. 202), sob pena de conflito entre os dois documentos.</w:t>
+        <w:t xml:space="preserve">Até a Data de Liberação é vedada aos Sócios Sujeitos à Retenção qualquer distribuição de lucros, dividendos, juros sobre capital próprio, redução de capital com restituição, resgate ou reembolso, ressalvado o item 5. Os lucros que lhes caberiam são destinados a reserva fundamentada em orçamento de capital aprovado anualmente em Assembleia (art. 196 da Lei 6.404/76), obrigando-se eles a votar favoravelmente a essa destinação; o Estatuto fixará o dividendo obrigatório em percentual compatível com esta Cláusula (art. 202). A retenção não alcança os frutos devidos aos usufrutuários, pagos normalmente.</w:t>
       </w:r>
     </w:p>
     <w:p>
@@ -857,27 +975,7 @@
           <w:sz w:val="19"/>
           <w:szCs w:val="19"/>
         </w:rPr>
-        <w:t xml:space="preserve">Não configuram distribuição vedada: (a) a </w:t>
-      </w:r>
-      <w:r>
-        <w:rPr>
-          <w:rFonts w:ascii="Cambria" w:cs="Cambria" w:eastAsia="Cambria" w:hAnsi="Cambria"/>
-          <w:b/>
-          <w:bCs/>
-          <w:color w:val="141C17"/>
-          <w:sz w:val="19"/>
-          <w:szCs w:val="19"/>
-        </w:rPr>
-        <w:t xml:space="preserve">retirada mensal dos usufrutuários</w:t>
-      </w:r>
-      <w:r>
-        <w:rPr>
-          <w:rFonts w:ascii="Cambria" w:cs="Cambria" w:eastAsia="Cambria" w:hAnsi="Cambria"/>
-          <w:color w:val="141C17"/>
-          <w:sz w:val="19"/>
-          <w:szCs w:val="19"/>
-        </w:rPr>
-        <w:t xml:space="preserve"> Wilson e Elman, de até R$ [•] cada, reajustável pelo IPCA, a título dos frutos que lhes pertencem por direito — a trava recai sobre a retirada dos filhos, não sobre o usufruto reservado na doação; (b) as parcelas do ITCMD da doação e os custos dos atos societários e registrais correlatos; (c) o pró-labore, em valor de mercado e aprovado em Assembleia, dos sócios que exerçam função; (d) o reembolso de despesas comprovadas no interesse da Companhia; (e) a devolução de mútuo formalizado. Os valores de (a) e (c) constam do Anexo II e sua majoração não pode ter por efeito substituir a distribuição vedada.</w:t>
+        <w:t xml:space="preserve">Não configuram distribuição vedada: (a) as parcelas do ITCMD da doação e os custos dos atos societários e registrais correlatos; (b) o pró-labore, em valor de mercado e aprovado em Assembleia, dos sócios que exerçam função na Companhia ou em suas controladas; (c) o reembolso de despesas comprovadas no interesse da Companhia; (d) a devolução de mútuo formalizado com juros de mercado e encargos recolhidos. Os valores de (b) constam do Anexo II e sua majoração não pode ter por efeito substituir a distribuição vedada.</w:t>
       </w:r>
     </w:p>
     <w:p>
@@ -903,7 +1001,7 @@
           <w:sz w:val="19"/>
           <w:szCs w:val="19"/>
         </w:rPr>
-        <w:t xml:space="preserve">Durante a retenção é vedado o pagamento de despesas pessoais pela Companhia ou controladas, o mútuo a sócio ou parte relacionada sem contrato e juros de mercado, a contratação de parte relacionada fora de mercado, o uso de bem social sem contrapartida e o desvio de oportunidade de negócio para veículo pessoal de sócio. As sociedades do grupo manterão contabilidades segregadas e contratos escritos entre si. A violação obriga à restituição integral e corrigida.</w:t>
+        <w:t xml:space="preserve">Durante a retenção é vedado o pagamento de despesas pessoais de Sócio Sujeito à Retenção pela Companhia ou controladas, o mútuo a sócio ou parte relacionada sem contrato e juros de mercado, a contratação fora de mercado, o uso de bem social sem contrapartida e o desvio de oportunidade de negócio. As sociedades manterão contabilidades segregadas e contratos escritos entre si. A violação obriga à restituição integral e corrigida.</w:t>
       </w:r>
     </w:p>
     <w:p>
@@ -929,7 +1027,7 @@
           <w:sz w:val="19"/>
           <w:szCs w:val="19"/>
         </w:rPr>
-        <w:t xml:space="preserve">A administração apresenta Relatório de Progresso das Metas semestralmente. Entendendo-as cumpridas, convoca Assembleia instruída com balancete de até 30 dias, declaração do contador, comprovação da extinção de cada obrigação e certidões das pessoas físicas e jurídicas envolvidas, que declara em ata a Data de Liberação. Qualquer sócio pode requerer, às suas expensas, verificação independente antes da deliberação.</w:t>
+        <w:t xml:space="preserve">A administração apresenta Relatório de Progresso das Metas semestralmente. Entendendo-as cumpridas, convoca Assembleia instruída com balancete de até 30 dias, declaração do contador, comprovação da extinção de cada obrigação e as certidões e consultas do item 3.1, que declara em ata a Data de Liberação. Qualquer sócio pode requerer, às suas expensas, verificação independente.</w:t>
       </w:r>
     </w:p>
     <w:p>
@@ -955,7 +1053,7 @@
           <w:sz w:val="19"/>
           <w:szCs w:val="19"/>
         </w:rPr>
-        <w:t xml:space="preserve">Aberta a distribuição, ela não pode reduzir o Caixa Mínimo abaixo do valor da Meta II — que deixa de ser meta e passa a ser piso permanente — e a Reserva Moradia segue indisponível até a aquisição. A distribuição fica automaticamente suspensa se for revelada obrigação do Perímetro anterior à declaração e dela não constante, se a Dívida Equacionada deixar de atender ao item 2.3, ou se o caixa cair abaixo do piso.</w:t>
+        <w:t xml:space="preserve">Aberta a distribuição, ela não pode reduzir o Caixa Mínimo abaixo do valor da Meta II — que deixa de ser meta e passa a ser piso permanente — e a Reserva Moradia segue indisponível até a aquisição. A distribuição fica automaticamente suspensa se for revelada obrigação do Perímetro anterior à declaração e dela não constante, ou se o caixa cair abaixo do piso.</w:t>
       </w:r>
     </w:p>
     <w:p>
@@ -1007,7 +1105,7 @@
           <w:sz w:val="19"/>
           <w:szCs w:val="19"/>
         </w:rPr>
-        <w:t xml:space="preserve">I — Mapa de Dívidas do Perímetro (credor, natureza, situação processual, garantias, coobrigados e status), com o Adiantamento Santa Helena destacado como item excluído. II — Retirada dos usufrutuários e pró-labore aprovados.</w:t>
+        <w:t xml:space="preserve">I — Mapa de Dívidas do Perímetro (credor, natureza, situação processual, garantias, coobrigados e status), com o Adiantamento Santa Helena destacado como item excluído. II — Pró-labore aprovado.</w:t>
       </w:r>
     </w:p>
     <w:p>
@@ -1025,7 +1123,7 @@
           <w:sz w:val="18"/>
           <w:szCs w:val="18"/>
         </w:rPr>
-        <w:t xml:space="preserve">TRÊS DEFINIÇÕES PENDENTES ANTES DE FECHAR A REDAÇÃO</w:t>
+        <w:t xml:space="preserve">DOIS PONTOS PARA O ADVOGADO ANTES DE FECHAR</w:t>
       </w:r>
     </w:p>
     <w:p>
@@ -1043,16 +1141,16 @@
           <w:sz w:val="19"/>
           <w:szCs w:val="19"/>
         </w:rPr>
-        <w:t xml:space="preserve">1.  Valor do imóvel da Meta III. </w:t>
-      </w:r>
-      <w:r>
-        <w:rPr>
-          <w:rFonts w:ascii="Cambria" w:cs="Cambria" w:eastAsia="Cambria" w:hAnsi="Cambria"/>
-          <w:color w:val="141C17"/>
-          <w:sz w:val="19"/>
-          <w:szCs w:val="19"/>
-        </w:rPr>
-        <w:t xml:space="preserve">A minuta está com R$ 1.060.000,00. Confirmar se é este o número ou R$ 1.600.000,00.</w:t>
+        <w:t xml:space="preserve">1.  Parcelamento fiscal e a Meta I. </w:t>
+      </w:r>
+      <w:r>
+        <w:rPr>
+          <w:rFonts w:ascii="Cambria" w:cs="Cambria" w:eastAsia="Cambria" w:hAnsi="Cambria"/>
+          <w:color w:val="141C17"/>
+          <w:sz w:val="19"/>
+          <w:szCs w:val="19"/>
+        </w:rPr>
+        <w:t xml:space="preserve">Como parcelamento em curso não conta como quitado (item 2.4), uma eventual adesão à transação da PGFN em 120 meses adia a Meta I até a quitação do saldo, mesmo com certidão limpa e sem restrição cadastral. É consequência assumida da regra de dívida zero — vale confirmar se é o efeito desejado.</w:t>
       </w:r>
     </w:p>
     <w:p>
@@ -1070,43 +1168,16 @@
           <w:sz w:val="19"/>
           <w:szCs w:val="19"/>
         </w:rPr>
-        <w:t xml:space="preserve">2.  Retirada dos usufrutuários (item 5, alínea a). </w:t>
-      </w:r>
-      <w:r>
-        <w:rPr>
-          <w:rFonts w:ascii="Cambria" w:cs="Cambria" w:eastAsia="Cambria" w:hAnsi="Cambria"/>
-          <w:color w:val="141C17"/>
-          <w:sz w:val="19"/>
-          <w:szCs w:val="19"/>
-        </w:rPr>
-        <w:t xml:space="preserve">Definir o valor mensal que Wilson e Elman seguem recebendo durante a retenção. A cláusula não pode ser um “ninguém recebe nada” puro: o usufruto é dos pais e os frutos lhes pertencem por direito.</w:t>
-      </w:r>
-    </w:p>
-    <w:p>
-      <w:pPr>
-        <w:spacing w:after="60" w:before="0"/>
-        <w:ind w:left="200"/>
-        <w:jc w:val="both"/>
-      </w:pPr>
-      <w:r>
-        <w:rPr>
-          <w:rFonts w:ascii="Cambria" w:cs="Cambria" w:eastAsia="Cambria" w:hAnsi="Cambria"/>
-          <w:b/>
-          <w:bCs/>
-          <w:color w:val="141C17"/>
-          <w:sz w:val="19"/>
-          <w:szCs w:val="19"/>
-        </w:rPr>
-        <w:t xml:space="preserve">3.  Dívidas em parcelamento oficial (item 2.3). </w:t>
-      </w:r>
-      <w:r>
-        <w:rPr>
-          <w:rFonts w:ascii="Cambria" w:cs="Cambria" w:eastAsia="Cambria" w:hAnsi="Cambria"/>
-          <w:color w:val="141C17"/>
-          <w:sz w:val="19"/>
-          <w:szCs w:val="19"/>
-        </w:rPr>
-        <w:t xml:space="preserve">Decidir se contam como cumpridas quando adimplentes e integralmente cobertas por reserva. Sem essa regra, uma transação da PGFN em 120 meses trava a distribuição por dez anos sozinha.</w:t>
+        <w:t xml:space="preserve">2.  Mecanismo de retenção seletiva. </w:t>
+      </w:r>
+      <w:r>
+        <w:rPr>
+          <w:rFonts w:ascii="Cambria" w:cs="Cambria" w:eastAsia="Cambria" w:hAnsi="Cambria"/>
+          <w:color w:val="141C17"/>
+          <w:sz w:val="19"/>
+          <w:szCs w:val="19"/>
+        </w:rPr>
+        <w:t xml:space="preserve">Reter o lucro de alguns sócios e pagar os frutos aos usufrutuários exige base estatutária: dividendo obrigatório compatível, reserva com orçamento de capital e obrigação de voto no acordo — ou classes distintas de ações para os sócios em partnership. Definir com o advogado.</w:t>
       </w:r>
     </w:p>
     <w:sectPr>

</xml_diff>